<commit_message>
feat: enhance nftables rule parsing, add user-friendly optimization feedback messages, and include session IDs in results.
</commit_message>
<xml_diff>
--- a/docs/Firewall_Rule_Optimizer_Project_Report.docx
+++ b/docs/Firewall_Rule_Optimizer_Project_Report.docx
@@ -1830,6 +1830,56 @@
     </w:p>
     <w:p>
       <w:pPr>
+        <w:jc w:val="center"/>
+      </w:pPr>
+      <w:r>
+        <w:drawing>
+          <wp:inline xmlns:a="http://schemas.openxmlformats.org/drawingml/2006/main" xmlns:pic="http://schemas.openxmlformats.org/drawingml/2006/picture">
+            <wp:extent cx="5486400" cy="5445325"/>
+            <wp:docPr id="4" name="Picture 4"/>
+            <wp:cNvGraphicFramePr>
+              <a:graphicFrameLocks noChangeAspect="1"/>
+            </wp:cNvGraphicFramePr>
+            <a:graphic>
+              <a:graphicData uri="http://schemas.openxmlformats.org/drawingml/2006/picture">
+                <pic:pic>
+                  <pic:nvPicPr>
+                    <pic:cNvPr id="0" name="landing_page_ready_1773328820897.png"/>
+                    <pic:cNvPicPr/>
+                  </pic:nvPicPr>
+                  <pic:blipFill>
+                    <a:blip r:embed="rId12"/>
+                    <a:stretch>
+                      <a:fillRect/>
+                    </a:stretch>
+                  </pic:blipFill>
+                  <pic:spPr>
+                    <a:xfrm>
+                      <a:off x="0" y="0"/>
+                      <a:ext cx="5486400" cy="5445325"/>
+                    </a:xfrm>
+                    <a:prstGeom prst="rect"/>
+                  </pic:spPr>
+                </pic:pic>
+              </a:graphicData>
+            </a:graphic>
+          </wp:inline>
+        </w:drawing>
+      </w:r>
+    </w:p>
+    <w:p>
+      <w:pPr>
+        <w:jc w:val="center"/>
+      </w:pPr>
+      <w:r>
+        <w:rPr>
+          <w:i/>
+        </w:rPr>
+        <w:t>Figure: System User Interface (Firewall Rule Analyzer Dashboard)</w:t>
+      </w:r>
+    </w:p>
+    <w:p>
+      <w:pPr>
         <w:pStyle w:val="ListBullet"/>
         <w:spacing w:after="240" w:line="360" w:lineRule="auto"/>
         <w:ind w:left="720"/>
@@ -3420,6 +3470,56 @@
     </w:p>
     <w:p>
       <w:pPr>
+        <w:jc w:val="center"/>
+      </w:pPr>
+      <w:r>
+        <w:drawing>
+          <wp:inline xmlns:a="http://schemas.openxmlformats.org/drawingml/2006/main" xmlns:pic="http://schemas.openxmlformats.org/drawingml/2006/picture">
+            <wp:extent cx="5486400" cy="4549170"/>
+            <wp:docPr id="2" name="Picture 2"/>
+            <wp:cNvGraphicFramePr>
+              <a:graphicFrameLocks noChangeAspect="1"/>
+            </wp:cNvGraphicFramePr>
+            <a:graphic>
+              <a:graphicData uri="http://schemas.openxmlformats.org/drawingml/2006/picture">
+                <pic:pic>
+                  <pic:nvPicPr>
+                    <pic:cNvPr id="0" name="dfd0.drawio.png"/>
+                    <pic:cNvPicPr/>
+                  </pic:nvPicPr>
+                  <pic:blipFill>
+                    <a:blip r:embed="rId10"/>
+                    <a:stretch>
+                      <a:fillRect/>
+                    </a:stretch>
+                  </pic:blipFill>
+                  <pic:spPr>
+                    <a:xfrm>
+                      <a:off x="0" y="0"/>
+                      <a:ext cx="5486400" cy="4549170"/>
+                    </a:xfrm>
+                    <a:prstGeom prst="rect"/>
+                  </pic:spPr>
+                </pic:pic>
+              </a:graphicData>
+            </a:graphic>
+          </wp:inline>
+        </w:drawing>
+      </w:r>
+    </w:p>
+    <w:p>
+      <w:pPr>
+        <w:jc w:val="center"/>
+      </w:pPr>
+      <w:r>
+        <w:rPr>
+          <w:i/>
+        </w:rPr>
+        <w:t>Figure: Data Flow Diagram (Level 0 - Context Diagram)</w:t>
+      </w:r>
+    </w:p>
+    <w:p>
+      <w:pPr>
         <w:spacing w:before="240" w:after="240" w:line="360" w:lineRule="auto"/>
         <w:jc w:val="left"/>
       </w:pPr>
@@ -3765,6 +3865,56 @@
     </w:p>
     <w:p>
       <w:pPr>
+        <w:jc w:val="center"/>
+      </w:pPr>
+      <w:r>
+        <w:drawing>
+          <wp:inline xmlns:a="http://schemas.openxmlformats.org/drawingml/2006/main" xmlns:pic="http://schemas.openxmlformats.org/drawingml/2006/picture">
+            <wp:extent cx="5486400" cy="5409127"/>
+            <wp:docPr id="3" name="Picture 3"/>
+            <wp:cNvGraphicFramePr>
+              <a:graphicFrameLocks noChangeAspect="1"/>
+            </wp:cNvGraphicFramePr>
+            <a:graphic>
+              <a:graphicData uri="http://schemas.openxmlformats.org/drawingml/2006/picture">
+                <pic:pic>
+                  <pic:nvPicPr>
+                    <pic:cNvPr id="0" name="dfd1.drawio.png"/>
+                    <pic:cNvPicPr/>
+                  </pic:nvPicPr>
+                  <pic:blipFill>
+                    <a:blip r:embed="rId11"/>
+                    <a:stretch>
+                      <a:fillRect/>
+                    </a:stretch>
+                  </pic:blipFill>
+                  <pic:spPr>
+                    <a:xfrm>
+                      <a:off x="0" y="0"/>
+                      <a:ext cx="5486400" cy="5409127"/>
+                    </a:xfrm>
+                    <a:prstGeom prst="rect"/>
+                  </pic:spPr>
+                </pic:pic>
+              </a:graphicData>
+            </a:graphic>
+          </wp:inline>
+        </w:drawing>
+      </w:r>
+    </w:p>
+    <w:p>
+      <w:pPr>
+        <w:jc w:val="center"/>
+      </w:pPr>
+      <w:r>
+        <w:rPr>
+          <w:i/>
+        </w:rPr>
+        <w:t>Figure: Data Flow Diagram (Level 1)</w:t>
+      </w:r>
+    </w:p>
+    <w:p>
+      <w:pPr>
         <w:spacing w:before="240" w:after="240" w:line="360" w:lineRule="auto"/>
         <w:jc w:val="left"/>
       </w:pPr>
@@ -4001,6 +4151,56 @@
           <w:sz w:val="24"/>
         </w:rPr>
         <w:t>System design is the transformative phase of the software development life cycle where the abstract requirements formulated during the analysis phase are systematically translated into comprehensive technical blueprints. This chapter provides a dense, granular exposition of the Firewall Rule Optimizer's internal architecture. It meticulously dissects the three-tier architectural layout, elucidating the specific design choices applied to the presentation, application, and data layers. The chapter further details the intricate class designs, outlining the object-oriented methodologies used to map complex network policies into manipulable Python classes. Finally, the chapter formally documents the structure of the REST API endpoints and explores the interface interaction designs intended to maximize end-user accessibility.</w:t>
+      </w:r>
+    </w:p>
+    <w:p>
+      <w:pPr>
+        <w:jc w:val="center"/>
+      </w:pPr>
+      <w:r>
+        <w:drawing>
+          <wp:inline xmlns:a="http://schemas.openxmlformats.org/drawingml/2006/main" xmlns:pic="http://schemas.openxmlformats.org/drawingml/2006/picture">
+            <wp:extent cx="5486400" cy="7527341"/>
+            <wp:docPr id="1" name="Picture 1"/>
+            <wp:cNvGraphicFramePr>
+              <a:graphicFrameLocks noChangeAspect="1"/>
+            </wp:cNvGraphicFramePr>
+            <a:graphic>
+              <a:graphicData uri="http://schemas.openxmlformats.org/drawingml/2006/picture">
+                <pic:pic>
+                  <pic:nvPicPr>
+                    <pic:cNvPr id="0" name="aystem_architecture.drawio.png"/>
+                    <pic:cNvPicPr/>
+                  </pic:nvPicPr>
+                  <pic:blipFill>
+                    <a:blip r:embed="rId9"/>
+                    <a:stretch>
+                      <a:fillRect/>
+                    </a:stretch>
+                  </pic:blipFill>
+                  <pic:spPr>
+                    <a:xfrm>
+                      <a:off x="0" y="0"/>
+                      <a:ext cx="5486400" cy="7527341"/>
+                    </a:xfrm>
+                    <a:prstGeom prst="rect"/>
+                  </pic:spPr>
+                </pic:pic>
+              </a:graphicData>
+            </a:graphic>
+          </wp:inline>
+        </w:drawing>
+      </w:r>
+    </w:p>
+    <w:p>
+      <w:pPr>
+        <w:jc w:val="center"/>
+      </w:pPr>
+      <w:r>
+        <w:rPr>
+          <w:i/>
+        </w:rPr>
+        <w:t>Figure: High-Level System Architecture</w:t>
       </w:r>
     </w:p>
     <w:p>

</xml_diff>